<commit_message>
Update 09-24-26 meeting minutes
Updated the official meeting minutes for 2026-09-24 to reflect the latest discussion, decisions, action items, and follow-up topics captured in the document.
</commit_message>
<xml_diff>
--- a/Meeting Minutes/09-24-26.docx
+++ b/Meeting Minutes/09-24-26.docx
@@ -1,6 +1,6 @@
 
 <file path=word/document.xml><?xml version="1.0" encoding="utf-8"?>
-<w:document xmlns:wpc="http://schemas.microsoft.com/office/word/2010/wordprocessingCanvas" xmlns:cx="http://schemas.microsoft.com/office/drawing/2014/chartex" xmlns:cx1="http://schemas.microsoft.com/office/drawing/2015/9/8/chartex" xmlns:cx2="http://schemas.microsoft.com/office/drawing/2015/10/21/chartex" xmlns:cx3="http://schemas.microsoft.com/office/drawing/2016/5/9/chartex" xmlns:cx4="http://schemas.microsoft.com/office/drawing/2016/5/10/chartex" xmlns:cx5="http://schemas.microsoft.com/office/drawing/2016/5/11/chartex" xmlns:cx6="http://schemas.microsoft.com/office/drawing/2016/5/12/chartex" xmlns:cx7="http://schemas.microsoft.com/office/drawing/2016/5/13/chartex" xmlns:cx8="http://schemas.microsoft.com/office/drawing/2016/5/14/chartex" xmlns:mc="http://schemas.openxmlformats.org/markup-compatibility/2006" xmlns:m="http://schemas.openxmlformats.org/officeDocument/2006/math" xmlns:aink="http://schemas.microsoft.com/office/drawing/2016/ink" xmlns:am3d="http://schemas.microsoft.com/office/drawing/2017/model3d" xmlns:oel="http://schemas.microsoft.com/office/2019/extlst" xmlns:r="http://schemas.openxmlformats.org/officeDocument/2006/relationships" xmlns:wp14="http://schemas.microsoft.com/office/word/2010/wordprocessingDrawing" xmlns:wp="http://schemas.openxmlformats.org/drawingml/2006/wordprocessingDrawing" xmlns:wpg="http://schemas.microsoft.com/office/word/2010/wordprocessingGroup" xmlns:wpi="http://schemas.microsoft.com/office/word/2010/wordprocessingInk" xmlns:wps="http://schemas.microsoft.com/office/word/2010/wordprocessingShape" xmlns:o="urn:schemas-microsoft-com:office:office" xmlns:v="urn:schemas-microsoft-com:vml" xmlns:w10="urn:schemas-microsoft-com:office:word" xmlns:w="http://schemas.openxmlformats.org/wordprocessingml/2006/main" xmlns:w14="http://schemas.microsoft.com/office/word/2010/wordml" xmlns:w15="http://schemas.microsoft.com/office/word/2012/wordml" xmlns:w16cex="http://schemas.microsoft.com/office/word/2018/wordml/cex" xmlns:w16cid="http://schemas.microsoft.com/office/word/2016/wordml/cid" xmlns:w16="http://schemas.microsoft.com/office/word/2018/wordml" xmlns:w16sdtdh="http://schemas.microsoft.com/office/word/2020/wordml/sdtdatahash" xmlns:w16sdtfl="http://schemas.microsoft.com/office/word/2024/wordml/sdtformatlock" xmlns:w16se="http://schemas.microsoft.com/office/word/2015/wordml/symex" xmlns:w16du="http://schemas.microsoft.com/office/word/2023/wordml/word16du" xmlns:wne="http://schemas.microsoft.com/office/word/2006/wordml" mc:Ignorable="w14 w15 w16se w16cid w16 w16cex w16sdtdh w16sdtfl w16du wp14">
+<w:document xmlns:wpc="http://schemas.microsoft.com/office/word/2010/wordprocessingCanvas" xmlns:cx="http://schemas.microsoft.com/office/drawing/2014/chartex" xmlns:cx1="http://schemas.microsoft.com/office/drawing/2015/9/8/chartex" xmlns:cx2="http://schemas.microsoft.com/office/drawing/2015/10/21/chartex" xmlns:cx3="http://schemas.microsoft.com/office/drawing/2016/5/9/chartex" xmlns:cx4="http://schemas.microsoft.com/office/drawing/2016/5/10/chartex" xmlns:cx5="http://schemas.microsoft.com/office/drawing/2016/5/11/chartex" xmlns:cx6="http://schemas.microsoft.com/office/drawing/2016/5/12/chartex" xmlns:cx7="http://schemas.microsoft.com/office/drawing/2016/5/13/chartex" xmlns:cx8="http://schemas.microsoft.com/office/drawing/2016/5/14/chartex" xmlns:mc="http://schemas.openxmlformats.org/markup-compatibility/2006" xmlns:aink="http://schemas.microsoft.com/office/drawing/2016/ink" xmlns:am3d="http://schemas.microsoft.com/office/drawing/2017/model3d" xmlns:o="urn:schemas-microsoft-com:office:office" xmlns:oel="http://schemas.microsoft.com/office/2019/extlst" xmlns:r="http://schemas.openxmlformats.org/officeDocument/2006/relationships" xmlns:m="http://schemas.openxmlformats.org/officeDocument/2006/math" xmlns:v="urn:schemas-microsoft-com:vml" xmlns:wp14="http://schemas.microsoft.com/office/word/2010/wordprocessingDrawing" xmlns:wp="http://schemas.openxmlformats.org/drawingml/2006/wordprocessingDrawing" xmlns:w10="urn:schemas-microsoft-com:office:word" xmlns:w="http://schemas.openxmlformats.org/wordprocessingml/2006/main" xmlns:w14="http://schemas.microsoft.com/office/word/2010/wordml" xmlns:w15="http://schemas.microsoft.com/office/word/2012/wordml" xmlns:w16cex="http://schemas.microsoft.com/office/word/2018/wordml/cex" xmlns:w16cid="http://schemas.microsoft.com/office/word/2016/wordml/cid" xmlns:w16="http://schemas.microsoft.com/office/word/2018/wordml" xmlns:w16du="http://schemas.microsoft.com/office/word/2023/wordml/word16du" xmlns:w16sdtdh="http://schemas.microsoft.com/office/word/2020/wordml/sdtdatahash" xmlns:w16sdtfl="http://schemas.microsoft.com/office/word/2024/wordml/sdtformatlock" xmlns:w16se="http://schemas.microsoft.com/office/word/2015/wordml/symex" xmlns:wpg="http://schemas.microsoft.com/office/word/2010/wordprocessingGroup" xmlns:wpi="http://schemas.microsoft.com/office/word/2010/wordprocessingInk" xmlns:wne="http://schemas.microsoft.com/office/word/2006/wordml" xmlns:wps="http://schemas.microsoft.com/office/word/2010/wordprocessingShape" mc:Ignorable="w14 w15 w16se w16cid w16 w16cex w16sdtdh w16sdtfl w16du wp14">
   <w:body>
     <w:tbl>
       <w:tblPr>
@@ -180,6 +180,22 @@
               </w:rPr>
               <w:t>Date of Last Sponsor Communication:</w:t>
             </w:r>
+            <w:r>
+              <w:rPr>
+                <w:rFonts w:asciiTheme="minorHAnsi" w:hAnsiTheme="minorHAnsi" w:cstheme="minorHAnsi"/>
+                <w:szCs w:val="24"/>
+              </w:rPr>
+              <w:t xml:space="preserve"> </w:t>
+            </w:r>
+            <w:r>
+              <w:rPr>
+                <w:rFonts w:asciiTheme="minorHAnsi" w:hAnsiTheme="minorHAnsi" w:cstheme="minorHAnsi"/>
+                <w:b/>
+                <w:bCs/>
+                <w:szCs w:val="24"/>
+              </w:rPr>
+              <w:t>09-24-2026</w:t>
+            </w:r>
           </w:p>
         </w:tc>
       </w:tr>
@@ -327,6 +343,90 @@
           </w:p>
           <w:p>
             <w:pPr>
+              <w:pStyle w:val="ListParagraph"/>
+              <w:numPr>
+                <w:ilvl w:val="0"/>
+                <w:numId w:val="6"/>
+              </w:numPr>
+              <w:rPr>
+                <w:rFonts w:asciiTheme="minorHAnsi" w:hAnsiTheme="minorHAnsi" w:cstheme="minorHAnsi"/>
+              </w:rPr>
+            </w:pPr>
+            <w:r>
+              <w:rPr>
+                <w:rFonts w:asciiTheme="minorHAnsi" w:hAnsiTheme="minorHAnsi" w:cstheme="minorHAnsi"/>
+              </w:rPr>
+              <w:t xml:space="preserve">Information learned from </w:t>
+            </w:r>
+            <w:r>
+              <w:rPr>
+                <w:rFonts w:asciiTheme="minorHAnsi" w:hAnsiTheme="minorHAnsi" w:cstheme="minorHAnsi"/>
+              </w:rPr>
+              <w:t>meeting with</w:t>
+            </w:r>
+            <w:r>
+              <w:rPr>
+                <w:rFonts w:asciiTheme="minorHAnsi" w:hAnsiTheme="minorHAnsi" w:cstheme="minorHAnsi"/>
+              </w:rPr>
+              <w:t xml:space="preserve"> the</w:t>
+            </w:r>
+            <w:r>
+              <w:rPr>
+                <w:rFonts w:asciiTheme="minorHAnsi" w:hAnsiTheme="minorHAnsi" w:cstheme="minorHAnsi"/>
+              </w:rPr>
+              <w:t xml:space="preserve"> Sponsor and Voice of Customer Deliverable.</w:t>
+            </w:r>
+          </w:p>
+          <w:p>
+            <w:pPr>
+              <w:pStyle w:val="ListParagraph"/>
+              <w:numPr>
+                <w:ilvl w:val="0"/>
+                <w:numId w:val="6"/>
+              </w:numPr>
+              <w:rPr>
+                <w:rFonts w:asciiTheme="minorHAnsi" w:hAnsiTheme="minorHAnsi" w:cstheme="minorHAnsi"/>
+              </w:rPr>
+            </w:pPr>
+            <w:r>
+              <w:rPr>
+                <w:rFonts w:asciiTheme="minorHAnsi" w:hAnsiTheme="minorHAnsi" w:cstheme="minorHAnsi"/>
+              </w:rPr>
+              <w:t xml:space="preserve">Metal Factory permits and </w:t>
+            </w:r>
+            <w:r>
+              <w:rPr>
+                <w:rFonts w:asciiTheme="minorHAnsi" w:hAnsiTheme="minorHAnsi" w:cstheme="minorHAnsi"/>
+              </w:rPr>
+              <w:t>level we should reach.</w:t>
+            </w:r>
+          </w:p>
+          <w:p>
+            <w:pPr>
+              <w:pStyle w:val="ListParagraph"/>
+              <w:numPr>
+                <w:ilvl w:val="0"/>
+                <w:numId w:val="6"/>
+              </w:numPr>
+              <w:rPr>
+                <w:rFonts w:asciiTheme="minorHAnsi" w:hAnsiTheme="minorHAnsi" w:cstheme="minorHAnsi"/>
+              </w:rPr>
+            </w:pPr>
+            <w:r>
+              <w:rPr>
+                <w:rFonts w:asciiTheme="minorHAnsi" w:hAnsiTheme="minorHAnsi" w:cstheme="minorHAnsi"/>
+              </w:rPr>
+              <w:t>Git Presentation</w:t>
+            </w:r>
+            <w:r>
+              <w:rPr>
+                <w:rFonts w:asciiTheme="minorHAnsi" w:hAnsiTheme="minorHAnsi" w:cstheme="minorHAnsi"/>
+              </w:rPr>
+              <w:t xml:space="preserve"> by Alex</w:t>
+            </w:r>
+          </w:p>
+          <w:p>
+            <w:pPr>
               <w:rPr>
                 <w:rFonts w:asciiTheme="minorHAnsi" w:hAnsiTheme="minorHAnsi" w:cstheme="minorHAnsi"/>
               </w:rPr>
@@ -397,10 +497,57 @@
           </w:p>
           <w:p>
             <w:pPr>
-              <w:rPr>
-                <w:rFonts w:asciiTheme="minorHAnsi" w:hAnsiTheme="minorHAnsi" w:cstheme="minorHAnsi"/>
-              </w:rPr>
-            </w:pPr>
+              <w:pStyle w:val="ListParagraph"/>
+              <w:numPr>
+                <w:ilvl w:val="0"/>
+                <w:numId w:val="7"/>
+              </w:numPr>
+              <w:rPr>
+                <w:rFonts w:asciiTheme="minorHAnsi" w:hAnsiTheme="minorHAnsi" w:cstheme="minorHAnsi"/>
+              </w:rPr>
+            </w:pPr>
+            <w:r>
+              <w:rPr>
+                <w:rFonts w:asciiTheme="minorHAnsi" w:hAnsiTheme="minorHAnsi" w:cstheme="minorHAnsi"/>
+              </w:rPr>
+              <w:t>Work together on the GANTT chart during next week’s meeting.</w:t>
+            </w:r>
+          </w:p>
+          <w:p>
+            <w:pPr>
+              <w:pStyle w:val="ListParagraph"/>
+              <w:numPr>
+                <w:ilvl w:val="0"/>
+                <w:numId w:val="7"/>
+              </w:numPr>
+              <w:rPr>
+                <w:rFonts w:asciiTheme="minorHAnsi" w:hAnsiTheme="minorHAnsi" w:cstheme="minorHAnsi"/>
+              </w:rPr>
+            </w:pPr>
+            <w:r>
+              <w:rPr>
+                <w:rFonts w:asciiTheme="minorHAnsi" w:hAnsiTheme="minorHAnsi" w:cstheme="minorHAnsi"/>
+              </w:rPr>
+              <w:t xml:space="preserve">Everyone </w:t>
+            </w:r>
+            <w:r>
+              <w:rPr>
+                <w:rFonts w:asciiTheme="minorHAnsi" w:hAnsiTheme="minorHAnsi" w:cstheme="minorHAnsi"/>
+              </w:rPr>
+              <w:t>acquires</w:t>
+            </w:r>
+            <w:r>
+              <w:rPr>
+                <w:rFonts w:asciiTheme="minorHAnsi" w:hAnsiTheme="minorHAnsi" w:cstheme="minorHAnsi"/>
+              </w:rPr>
+              <w:t xml:space="preserve"> Metal Factory</w:t>
+            </w:r>
+            <w:r>
+              <w:rPr>
+                <w:rFonts w:asciiTheme="minorHAnsi" w:hAnsiTheme="minorHAnsi" w:cstheme="minorHAnsi"/>
+              </w:rPr>
+              <w:t xml:space="preserve"> green level certification.</w:t>
+            </w:r>
           </w:p>
           <w:p>
             <w:pPr>
@@ -617,6 +764,18 @@
                 <w:rFonts w:asciiTheme="minorHAnsi" w:hAnsiTheme="minorHAnsi" w:cstheme="minorHAnsi"/>
               </w:rPr>
             </w:pPr>
+            <w:r>
+              <w:rPr>
+                <w:rFonts w:asciiTheme="minorHAnsi" w:hAnsiTheme="minorHAnsi" w:cstheme="minorHAnsi"/>
+              </w:rPr>
+              <w:t>Metal Factory Certification</w:t>
+            </w:r>
+            <w:r>
+              <w:rPr>
+                <w:rFonts w:asciiTheme="minorHAnsi" w:hAnsiTheme="minorHAnsi" w:cstheme="minorHAnsi"/>
+              </w:rPr>
+              <w:t xml:space="preserve"> (Green)</w:t>
+            </w:r>
           </w:p>
         </w:tc>
         <w:tc>
@@ -632,6 +791,12 @@
                 <w:rFonts w:asciiTheme="minorHAnsi" w:hAnsiTheme="minorHAnsi" w:cstheme="minorHAnsi"/>
               </w:rPr>
             </w:pPr>
+            <w:r>
+              <w:rPr>
+                <w:rFonts w:asciiTheme="minorHAnsi" w:hAnsiTheme="minorHAnsi" w:cstheme="minorHAnsi"/>
+              </w:rPr>
+              <w:t>Ben, Jacob, Alex</w:t>
+            </w:r>
           </w:p>
         </w:tc>
         <w:tc>
@@ -648,6 +813,12 @@
                 <w:rFonts w:asciiTheme="minorHAnsi" w:hAnsiTheme="minorHAnsi" w:cstheme="minorHAnsi"/>
               </w:rPr>
             </w:pPr>
+            <w:r>
+              <w:rPr>
+                <w:rFonts w:asciiTheme="minorHAnsi" w:hAnsiTheme="minorHAnsi" w:cstheme="minorHAnsi"/>
+              </w:rPr>
+              <w:t>10/1/26</w:t>
+            </w:r>
           </w:p>
         </w:tc>
       </w:tr>
@@ -669,6 +840,12 @@
                 <w:rFonts w:asciiTheme="minorHAnsi" w:hAnsiTheme="minorHAnsi" w:cstheme="minorHAnsi"/>
               </w:rPr>
             </w:pPr>
+            <w:r>
+              <w:rPr>
+                <w:rFonts w:asciiTheme="minorHAnsi" w:hAnsiTheme="minorHAnsi" w:cstheme="minorHAnsi"/>
+              </w:rPr>
+              <w:t>Upload Voice of Customer</w:t>
+            </w:r>
           </w:p>
         </w:tc>
         <w:tc>
@@ -684,6 +861,12 @@
                 <w:rFonts w:asciiTheme="minorHAnsi" w:hAnsiTheme="minorHAnsi" w:cstheme="minorHAnsi"/>
               </w:rPr>
             </w:pPr>
+            <w:r>
+              <w:rPr>
+                <w:rFonts w:asciiTheme="minorHAnsi" w:hAnsiTheme="minorHAnsi" w:cstheme="minorHAnsi"/>
+              </w:rPr>
+              <w:t>Jacob</w:t>
+            </w:r>
           </w:p>
         </w:tc>
         <w:tc>
@@ -700,6 +883,12 @@
                 <w:rFonts w:asciiTheme="minorHAnsi" w:hAnsiTheme="minorHAnsi" w:cstheme="minorHAnsi"/>
               </w:rPr>
             </w:pPr>
+            <w:r>
+              <w:rPr>
+                <w:rFonts w:asciiTheme="minorHAnsi" w:hAnsiTheme="minorHAnsi" w:cstheme="minorHAnsi"/>
+              </w:rPr>
+              <w:t>9/24/26</w:t>
+            </w:r>
           </w:p>
         </w:tc>
       </w:tr>
@@ -820,8 +1009,97 @@
 </file>
 
 <file path=word/numbering.xml><?xml version="1.0" encoding="utf-8"?>
-<w:numbering xmlns:wpc="http://schemas.microsoft.com/office/word/2010/wordprocessingCanvas" xmlns:cx="http://schemas.microsoft.com/office/drawing/2014/chartex" xmlns:cx1="http://schemas.microsoft.com/office/drawing/2015/9/8/chartex" xmlns:cx2="http://schemas.microsoft.com/office/drawing/2015/10/21/chartex" xmlns:cx3="http://schemas.microsoft.com/office/drawing/2016/5/9/chartex" xmlns:cx4="http://schemas.microsoft.com/office/drawing/2016/5/10/chartex" xmlns:cx5="http://schemas.microsoft.com/office/drawing/2016/5/11/chartex" xmlns:cx6="http://schemas.microsoft.com/office/drawing/2016/5/12/chartex" xmlns:cx7="http://schemas.microsoft.com/office/drawing/2016/5/13/chartex" xmlns:cx8="http://schemas.microsoft.com/office/drawing/2016/5/14/chartex" xmlns:mc="http://schemas.openxmlformats.org/markup-compatibility/2006" xmlns:m="http://schemas.openxmlformats.org/officeDocument/2006/math" xmlns:aink="http://schemas.microsoft.com/office/drawing/2016/ink" xmlns:am3d="http://schemas.microsoft.com/office/drawing/2017/model3d" xmlns:oel="http://schemas.microsoft.com/office/2019/extlst" xmlns:r="http://schemas.openxmlformats.org/officeDocument/2006/relationships" xmlns:wp14="http://schemas.microsoft.com/office/word/2010/wordprocessingDrawing" xmlns:wp="http://schemas.openxmlformats.org/drawingml/2006/wordprocessingDrawing" xmlns:wpg="http://schemas.microsoft.com/office/word/2010/wordprocessingGroup" xmlns:wpi="http://schemas.microsoft.com/office/word/2010/wordprocessingInk" xmlns:wps="http://schemas.microsoft.com/office/word/2010/wordprocessingShape" xmlns:o="urn:schemas-microsoft-com:office:office" xmlns:v="urn:schemas-microsoft-com:vml" xmlns:w10="urn:schemas-microsoft-com:office:word" xmlns:w="http://schemas.openxmlformats.org/wordprocessingml/2006/main" xmlns:w14="http://schemas.microsoft.com/office/word/2010/wordml" xmlns:w15="http://schemas.microsoft.com/office/word/2012/wordml" xmlns:w16cex="http://schemas.microsoft.com/office/word/2018/wordml/cex" xmlns:w16cid="http://schemas.microsoft.com/office/word/2016/wordml/cid" xmlns:w16="http://schemas.microsoft.com/office/word/2018/wordml" xmlns:w16sdtdh="http://schemas.microsoft.com/office/word/2020/wordml/sdtdatahash" xmlns:w16sdtfl="http://schemas.microsoft.com/office/word/2024/wordml/sdtformatlock" xmlns:w16se="http://schemas.microsoft.com/office/word/2015/wordml/symex" xmlns:w16du="http://schemas.microsoft.com/office/word/2023/wordml/word16du" xmlns:wne="http://schemas.microsoft.com/office/word/2006/wordml" mc:Ignorable="w14 w15 w16se w16cid w16 w16cex w16sdtdh w16sdtfl w16du wp14">
+<w:numbering xmlns:wpc="http://schemas.microsoft.com/office/word/2010/wordprocessingCanvas" xmlns:cx="http://schemas.microsoft.com/office/drawing/2014/chartex" xmlns:cx1="http://schemas.microsoft.com/office/drawing/2015/9/8/chartex" xmlns:cx2="http://schemas.microsoft.com/office/drawing/2015/10/21/chartex" xmlns:cx3="http://schemas.microsoft.com/office/drawing/2016/5/9/chartex" xmlns:cx4="http://schemas.microsoft.com/office/drawing/2016/5/10/chartex" xmlns:cx5="http://schemas.microsoft.com/office/drawing/2016/5/11/chartex" xmlns:cx6="http://schemas.microsoft.com/office/drawing/2016/5/12/chartex" xmlns:cx7="http://schemas.microsoft.com/office/drawing/2016/5/13/chartex" xmlns:cx8="http://schemas.microsoft.com/office/drawing/2016/5/14/chartex" xmlns:mc="http://schemas.openxmlformats.org/markup-compatibility/2006" xmlns:aink="http://schemas.microsoft.com/office/drawing/2016/ink" xmlns:am3d="http://schemas.microsoft.com/office/drawing/2017/model3d" xmlns:o="urn:schemas-microsoft-com:office:office" xmlns:oel="http://schemas.microsoft.com/office/2019/extlst" xmlns:r="http://schemas.openxmlformats.org/officeDocument/2006/relationships" xmlns:m="http://schemas.openxmlformats.org/officeDocument/2006/math" xmlns:v="urn:schemas-microsoft-com:vml" xmlns:wp14="http://schemas.microsoft.com/office/word/2010/wordprocessingDrawing" xmlns:wp="http://schemas.openxmlformats.org/drawingml/2006/wordprocessingDrawing" xmlns:w10="urn:schemas-microsoft-com:office:word" xmlns:w="http://schemas.openxmlformats.org/wordprocessingml/2006/main" xmlns:w14="http://schemas.microsoft.com/office/word/2010/wordml" xmlns:w15="http://schemas.microsoft.com/office/word/2012/wordml" xmlns:w16cex="http://schemas.microsoft.com/office/word/2018/wordml/cex" xmlns:w16cid="http://schemas.microsoft.com/office/word/2016/wordml/cid" xmlns:w16="http://schemas.microsoft.com/office/word/2018/wordml" xmlns:w16du="http://schemas.microsoft.com/office/word/2023/wordml/word16du" xmlns:w16sdtdh="http://schemas.microsoft.com/office/word/2020/wordml/sdtdatahash" xmlns:w16sdtfl="http://schemas.microsoft.com/office/word/2024/wordml/sdtformatlock" xmlns:w16se="http://schemas.microsoft.com/office/word/2015/wordml/symex" xmlns:wpg="http://schemas.microsoft.com/office/word/2010/wordprocessingGroup" xmlns:wpi="http://schemas.microsoft.com/office/word/2010/wordprocessingInk" xmlns:wne="http://schemas.microsoft.com/office/word/2006/wordml" xmlns:wps="http://schemas.microsoft.com/office/word/2010/wordprocessingShape" mc:Ignorable="w14 w15 w16se w16cid w16 w16cex w16sdtdh w16sdtfl w16du wp14">
   <w:abstractNum w:abstractNumId="0" w15:restartNumberingAfterBreak="0">
+    <w:nsid w:val="0B0456DD"/>
+    <w:multiLevelType w:val="hybridMultilevel"/>
+    <w:tmpl w:val="7F0C752A"/>
+    <w:lvl w:ilvl="0" w:tplc="0409000F">
+      <w:start w:val="1"/>
+      <w:numFmt w:val="decimal"/>
+      <w:lvlText w:val="%1."/>
+      <w:lvlJc w:val="left"/>
+      <w:pPr>
+        <w:ind w:left="720" w:hanging="360"/>
+      </w:pPr>
+      <w:rPr>
+        <w:rFonts w:hint="default"/>
+      </w:rPr>
+    </w:lvl>
+    <w:lvl w:ilvl="1" w:tplc="04090019" w:tentative="1">
+      <w:start w:val="1"/>
+      <w:numFmt w:val="lowerLetter"/>
+      <w:lvlText w:val="%2."/>
+      <w:lvlJc w:val="left"/>
+      <w:pPr>
+        <w:ind w:left="1440" w:hanging="360"/>
+      </w:pPr>
+    </w:lvl>
+    <w:lvl w:ilvl="2" w:tplc="0409001B" w:tentative="1">
+      <w:start w:val="1"/>
+      <w:numFmt w:val="lowerRoman"/>
+      <w:lvlText w:val="%3."/>
+      <w:lvlJc w:val="right"/>
+      <w:pPr>
+        <w:ind w:left="2160" w:hanging="180"/>
+      </w:pPr>
+    </w:lvl>
+    <w:lvl w:ilvl="3" w:tplc="0409000F" w:tentative="1">
+      <w:start w:val="1"/>
+      <w:numFmt w:val="decimal"/>
+      <w:lvlText w:val="%4."/>
+      <w:lvlJc w:val="left"/>
+      <w:pPr>
+        <w:ind w:left="2880" w:hanging="360"/>
+      </w:pPr>
+    </w:lvl>
+    <w:lvl w:ilvl="4" w:tplc="04090019" w:tentative="1">
+      <w:start w:val="1"/>
+      <w:numFmt w:val="lowerLetter"/>
+      <w:lvlText w:val="%5."/>
+      <w:lvlJc w:val="left"/>
+      <w:pPr>
+        <w:ind w:left="3600" w:hanging="360"/>
+      </w:pPr>
+    </w:lvl>
+    <w:lvl w:ilvl="5" w:tplc="0409001B" w:tentative="1">
+      <w:start w:val="1"/>
+      <w:numFmt w:val="lowerRoman"/>
+      <w:lvlText w:val="%6."/>
+      <w:lvlJc w:val="right"/>
+      <w:pPr>
+        <w:ind w:left="4320" w:hanging="180"/>
+      </w:pPr>
+    </w:lvl>
+    <w:lvl w:ilvl="6" w:tplc="0409000F" w:tentative="1">
+      <w:start w:val="1"/>
+      <w:numFmt w:val="decimal"/>
+      <w:lvlText w:val="%7."/>
+      <w:lvlJc w:val="left"/>
+      <w:pPr>
+        <w:ind w:left="5040" w:hanging="360"/>
+      </w:pPr>
+    </w:lvl>
+    <w:lvl w:ilvl="7" w:tplc="04090019" w:tentative="1">
+      <w:start w:val="1"/>
+      <w:numFmt w:val="lowerLetter"/>
+      <w:lvlText w:val="%8."/>
+      <w:lvlJc w:val="left"/>
+      <w:pPr>
+        <w:ind w:left="5760" w:hanging="360"/>
+      </w:pPr>
+    </w:lvl>
+    <w:lvl w:ilvl="8" w:tplc="0409001B" w:tentative="1">
+      <w:start w:val="1"/>
+      <w:numFmt w:val="lowerRoman"/>
+      <w:lvlText w:val="%9."/>
+      <w:lvlJc w:val="right"/>
+      <w:pPr>
+        <w:ind w:left="6480" w:hanging="180"/>
+      </w:pPr>
+    </w:lvl>
+  </w:abstractNum>
+  <w:abstractNum w:abstractNumId="1" w15:restartNumberingAfterBreak="0">
     <w:nsid w:val="0CF11A53"/>
     <w:multiLevelType w:val="hybridMultilevel"/>
     <w:tmpl w:val="2E6A06FA"/>
@@ -934,7 +1212,7 @@
       </w:pPr>
     </w:lvl>
   </w:abstractNum>
-  <w:abstractNum w:abstractNumId="1" w15:restartNumberingAfterBreak="0">
+  <w:abstractNum w:abstractNumId="2" w15:restartNumberingAfterBreak="0">
     <w:nsid w:val="21B43426"/>
     <w:multiLevelType w:val="hybridMultilevel"/>
     <w:tmpl w:val="8CD07B06"/>
@@ -1074,7 +1352,7 @@
       </w:rPr>
     </w:lvl>
   </w:abstractNum>
-  <w:abstractNum w:abstractNumId="2" w15:restartNumberingAfterBreak="0">
+  <w:abstractNum w:abstractNumId="3" w15:restartNumberingAfterBreak="0">
     <w:nsid w:val="334807A8"/>
     <w:multiLevelType w:val="multilevel"/>
     <w:tmpl w:val="BE30A754"/>
@@ -1223,7 +1501,96 @@
       </w:rPr>
     </w:lvl>
   </w:abstractNum>
-  <w:abstractNum w:abstractNumId="3" w15:restartNumberingAfterBreak="0">
+  <w:abstractNum w:abstractNumId="4" w15:restartNumberingAfterBreak="0">
+    <w:nsid w:val="3AC96A74"/>
+    <w:multiLevelType w:val="hybridMultilevel"/>
+    <w:tmpl w:val="FB1849BC"/>
+    <w:lvl w:ilvl="0" w:tplc="0409000F">
+      <w:start w:val="1"/>
+      <w:numFmt w:val="decimal"/>
+      <w:lvlText w:val="%1."/>
+      <w:lvlJc w:val="left"/>
+      <w:pPr>
+        <w:ind w:left="720" w:hanging="360"/>
+      </w:pPr>
+      <w:rPr>
+        <w:rFonts w:hint="default"/>
+      </w:rPr>
+    </w:lvl>
+    <w:lvl w:ilvl="1" w:tplc="04090019" w:tentative="1">
+      <w:start w:val="1"/>
+      <w:numFmt w:val="lowerLetter"/>
+      <w:lvlText w:val="%2."/>
+      <w:lvlJc w:val="left"/>
+      <w:pPr>
+        <w:ind w:left="1440" w:hanging="360"/>
+      </w:pPr>
+    </w:lvl>
+    <w:lvl w:ilvl="2" w:tplc="0409001B" w:tentative="1">
+      <w:start w:val="1"/>
+      <w:numFmt w:val="lowerRoman"/>
+      <w:lvlText w:val="%3."/>
+      <w:lvlJc w:val="right"/>
+      <w:pPr>
+        <w:ind w:left="2160" w:hanging="180"/>
+      </w:pPr>
+    </w:lvl>
+    <w:lvl w:ilvl="3" w:tplc="0409000F" w:tentative="1">
+      <w:start w:val="1"/>
+      <w:numFmt w:val="decimal"/>
+      <w:lvlText w:val="%4."/>
+      <w:lvlJc w:val="left"/>
+      <w:pPr>
+        <w:ind w:left="2880" w:hanging="360"/>
+      </w:pPr>
+    </w:lvl>
+    <w:lvl w:ilvl="4" w:tplc="04090019" w:tentative="1">
+      <w:start w:val="1"/>
+      <w:numFmt w:val="lowerLetter"/>
+      <w:lvlText w:val="%5."/>
+      <w:lvlJc w:val="left"/>
+      <w:pPr>
+        <w:ind w:left="3600" w:hanging="360"/>
+      </w:pPr>
+    </w:lvl>
+    <w:lvl w:ilvl="5" w:tplc="0409001B" w:tentative="1">
+      <w:start w:val="1"/>
+      <w:numFmt w:val="lowerRoman"/>
+      <w:lvlText w:val="%6."/>
+      <w:lvlJc w:val="right"/>
+      <w:pPr>
+        <w:ind w:left="4320" w:hanging="180"/>
+      </w:pPr>
+    </w:lvl>
+    <w:lvl w:ilvl="6" w:tplc="0409000F" w:tentative="1">
+      <w:start w:val="1"/>
+      <w:numFmt w:val="decimal"/>
+      <w:lvlText w:val="%7."/>
+      <w:lvlJc w:val="left"/>
+      <w:pPr>
+        <w:ind w:left="5040" w:hanging="360"/>
+      </w:pPr>
+    </w:lvl>
+    <w:lvl w:ilvl="7" w:tplc="04090019" w:tentative="1">
+      <w:start w:val="1"/>
+      <w:numFmt w:val="lowerLetter"/>
+      <w:lvlText w:val="%8."/>
+      <w:lvlJc w:val="left"/>
+      <w:pPr>
+        <w:ind w:left="5760" w:hanging="360"/>
+      </w:pPr>
+    </w:lvl>
+    <w:lvl w:ilvl="8" w:tplc="0409001B" w:tentative="1">
+      <w:start w:val="1"/>
+      <w:numFmt w:val="lowerRoman"/>
+      <w:lvlText w:val="%9."/>
+      <w:lvlJc w:val="right"/>
+      <w:pPr>
+        <w:ind w:left="6480" w:hanging="180"/>
+      </w:pPr>
+    </w:lvl>
+  </w:abstractNum>
+  <w:abstractNum w:abstractNumId="5" w15:restartNumberingAfterBreak="0">
     <w:nsid w:val="431F5019"/>
     <w:multiLevelType w:val="hybridMultilevel"/>
     <w:tmpl w:val="233AE490"/>
@@ -1336,7 +1703,7 @@
       </w:pPr>
     </w:lvl>
   </w:abstractNum>
-  <w:abstractNum w:abstractNumId="4" w15:restartNumberingAfterBreak="0">
+  <w:abstractNum w:abstractNumId="6" w15:restartNumberingAfterBreak="0">
     <w:nsid w:val="5A1109CB"/>
     <w:multiLevelType w:val="hybridMultilevel"/>
     <w:tmpl w:val="A29A75C8"/>
@@ -1450,25 +1817,31 @@
     </w:lvl>
   </w:abstractNum>
   <w:num w:numId="1" w16cid:durableId="1087311546">
+    <w:abstractNumId w:val="3"/>
+  </w:num>
+  <w:num w:numId="2" w16cid:durableId="1782263274">
+    <w:abstractNumId w:val="5"/>
+  </w:num>
+  <w:num w:numId="3" w16cid:durableId="1414930588">
+    <w:abstractNumId w:val="6"/>
+  </w:num>
+  <w:num w:numId="4" w16cid:durableId="1938823810">
     <w:abstractNumId w:val="2"/>
   </w:num>
-  <w:num w:numId="2" w16cid:durableId="1782263274">
-    <w:abstractNumId w:val="3"/>
+  <w:num w:numId="5" w16cid:durableId="1762027264">
+    <w:abstractNumId w:val="1"/>
   </w:num>
-  <w:num w:numId="3" w16cid:durableId="1414930588">
+  <w:num w:numId="6" w16cid:durableId="637491268">
     <w:abstractNumId w:val="4"/>
   </w:num>
-  <w:num w:numId="4" w16cid:durableId="1938823810">
-    <w:abstractNumId w:val="1"/>
-  </w:num>
-  <w:num w:numId="5" w16cid:durableId="1762027264">
+  <w:num w:numId="7" w16cid:durableId="1494179854">
     <w:abstractNumId w:val="0"/>
   </w:num>
 </w:numbering>
 </file>
 
 <file path=word/styles.xml><?xml version="1.0" encoding="utf-8"?>
-<w:styles xmlns:mc="http://schemas.openxmlformats.org/markup-compatibility/2006" xmlns:r="http://schemas.openxmlformats.org/officeDocument/2006/relationships" xmlns:w="http://schemas.openxmlformats.org/wordprocessingml/2006/main" xmlns:w14="http://schemas.microsoft.com/office/word/2010/wordml" xmlns:w15="http://schemas.microsoft.com/office/word/2012/wordml" xmlns:w16cex="http://schemas.microsoft.com/office/word/2018/wordml/cex" xmlns:w16cid="http://schemas.microsoft.com/office/word/2016/wordml/cid" xmlns:w16="http://schemas.microsoft.com/office/word/2018/wordml" xmlns:w16sdtdh="http://schemas.microsoft.com/office/word/2020/wordml/sdtdatahash" xmlns:w16sdtfl="http://schemas.microsoft.com/office/word/2024/wordml/sdtformatlock" xmlns:w16se="http://schemas.microsoft.com/office/word/2015/wordml/symex" xmlns:w16du="http://schemas.microsoft.com/office/word/2023/wordml/word16du" mc:Ignorable="w14 w15 w16se w16cid w16 w16cex w16sdtdh w16sdtfl w16du">
+<w:styles xmlns:mc="http://schemas.openxmlformats.org/markup-compatibility/2006" xmlns:r="http://schemas.openxmlformats.org/officeDocument/2006/relationships" xmlns:w="http://schemas.openxmlformats.org/wordprocessingml/2006/main" xmlns:w14="http://schemas.microsoft.com/office/word/2010/wordml" xmlns:w15="http://schemas.microsoft.com/office/word/2012/wordml" xmlns:w16cex="http://schemas.microsoft.com/office/word/2018/wordml/cex" xmlns:w16cid="http://schemas.microsoft.com/office/word/2016/wordml/cid" xmlns:w16="http://schemas.microsoft.com/office/word/2018/wordml" xmlns:w16du="http://schemas.microsoft.com/office/word/2023/wordml/word16du" xmlns:w16sdtdh="http://schemas.microsoft.com/office/word/2020/wordml/sdtdatahash" xmlns:w16sdtfl="http://schemas.microsoft.com/office/word/2024/wordml/sdtformatlock" xmlns:w16se="http://schemas.microsoft.com/office/word/2015/wordml/symex" mc:Ignorable="w14 w15 w16se w16cid w16 w16cex w16sdtdh w16sdtfl w16du">
   <w:docDefaults>
     <w:rPrDefault>
       <w:rPr>
@@ -1965,6 +2338,17 @@
       <w:bCs/>
     </w:rPr>
   </w:style>
+  <w:style w:type="paragraph" w:styleId="ListParagraph">
+    <w:name w:val="List Paragraph"/>
+    <w:basedOn w:val="Normal"/>
+    <w:uiPriority w:val="34"/>
+    <w:qFormat/>
+    <w:rsid w:val="005F7B13"/>
+    <w:pPr>
+      <w:ind w:left="720"/>
+      <w:contextualSpacing/>
+    </w:pPr>
+  </w:style>
 </w:styles>
 </file>
 

</xml_diff>